<commit_message>
i18n M2: language switcher component (endonym labels, cookie, header+drawer)
</commit_message>
<xml_diff>
--- a/docs/I18N-REGISTERS.docx
+++ b/docs/I18N-REGISTERS.docx
@@ -1256,11 +1256,61 @@
               <w:t xml:space="preserve">&lt;html lang&gt;</w:t>
             </w:r>
             <w:r>
-              <w:t xml:space="preserve">,</w:t>
-            </w:r>
-            <w:r>
-              <w:t xml:space="preserve"> </w:t>
-            </w:r>
+              <w:t xml:space="preserve"> </w:t>
+            </w:r>
+            <w:r>
+              <w:t xml:space="preserve">dynamic per locale</w:t>
+            </w:r>
+          </w:p>
+        </w:tc>
+        <w:tc>
+          <w:tcPr/>
+          <w:p>
+            <w:pPr>
+              <w:pStyle w:val="Compact"/>
+              <w:jc w:val="left"/>
+            </w:pPr>
+            <w:r>
+              <w:t xml:space="preserve">✅</w:t>
+            </w:r>
+            <w:r>
+              <w:t xml:space="preserve"> </w:t>
+            </w:r>
+            <w:r>
+              <w:rPr>
+                <w:rStyle w:val="VerbatimChar"/>
+              </w:rPr>
+              <w:t xml:space="preserve">BaseLayout.astro</w:t>
+            </w:r>
+            <w:r>
+              <w:t xml:space="preserve"> </w:t>
+            </w:r>
+            <w:r>
+              <w:t xml:space="preserve">(derives from</w:t>
+            </w:r>
+            <w:r>
+              <w:t xml:space="preserve"> </w:t>
+            </w:r>
+            <w:r>
+              <w:rPr>
+                <w:rStyle w:val="VerbatimChar"/>
+              </w:rPr>
+              <w:t xml:space="preserve">HTML_LANG[locale]</w:t>
+            </w:r>
+            <w:r>
+              <w:t xml:space="preserve">)</w:t>
+            </w:r>
+          </w:p>
+        </w:tc>
+      </w:tr>
+      <w:tr>
+        <w:tc>
+          <w:tcPr/>
+          <w:p>
+            <w:pPr>
+              <w:pStyle w:val="Compact"/>
+              <w:jc w:val="left"/>
+            </w:pPr>
             <w:r>
               <w:rPr>
                 <w:rStyle w:val="VerbatimChar"/>
@@ -1400,6 +1450,84 @@
             </w:pPr>
             <w:r>
               <w:t xml:space="preserve">⚠ NOT BUILT</w:t>
+            </w:r>
+          </w:p>
+        </w:tc>
+      </w:tr>
+      <w:tr>
+        <w:tc>
+          <w:tcPr/>
+          <w:p>
+            <w:pPr>
+              <w:pStyle w:val="Compact"/>
+              <w:jc w:val="left"/>
+            </w:pPr>
+            <w:r>
+              <w:t xml:space="preserve">Chrome catalogue wired to all components</w:t>
+            </w:r>
+          </w:p>
+        </w:tc>
+        <w:tc>
+          <w:tcPr/>
+          <w:p>
+            <w:pPr>
+              <w:pStyle w:val="Compact"/>
+              <w:jc w:val="left"/>
+            </w:pPr>
+            <w:r>
+              <w:t xml:space="preserve">✅ Header, Footer, SubscribeForm, ArticleCard, RailItem, ScenarioNav</w:t>
+            </w:r>
+          </w:p>
+        </w:tc>
+      </w:tr>
+      <w:tr>
+        <w:tc>
+          <w:tcPr/>
+          <w:p>
+            <w:pPr>
+              <w:pStyle w:val="Compact"/>
+              <w:jc w:val="left"/>
+            </w:pPr>
+            <w:r>
+              <w:t xml:space="preserve">Chrome catalogue wired to all pages</w:t>
+            </w:r>
+          </w:p>
+        </w:tc>
+        <w:tc>
+          <w:tcPr/>
+          <w:p>
+            <w:pPr>
+              <w:pStyle w:val="Compact"/>
+              <w:jc w:val="left"/>
+            </w:pPr>
+            <w:r>
+              <w:t xml:space="preserve">✅ index, subscribe, 404, archive, [scenario], articles/[slug]</w:t>
+            </w:r>
+          </w:p>
+        </w:tc>
+      </w:tr>
+      <w:tr>
+        <w:tc>
+          <w:tcPr/>
+          <w:p>
+            <w:pPr>
+              <w:pStyle w:val="Compact"/>
+              <w:jc w:val="left"/>
+            </w:pPr>
+            <w:r>
+              <w:t xml:space="preserve">Client-side strings via data-strings</w:t>
+            </w:r>
+          </w:p>
+        </w:tc>
+        <w:tc>
+          <w:tcPr/>
+          <w:p>
+            <w:pPr>
+              <w:pStyle w:val="Compact"/>
+              <w:jc w:val="left"/>
+            </w:pPr>
+            <w:r>
+              <w:t xml:space="preserve">✅ SubscribeForm (error/success messages)</w:t>
             </w:r>
           </w:p>
         </w:tc>

</xml_diff>

<commit_message>
i18n M2 complete: Taglish chrome style guide + review checkpoint
</commit_message>
<xml_diff>
--- a/docs/I18N-REGISTERS.docx
+++ b/docs/I18N-REGISTERS.docx
@@ -1236,6 +1236,115 @@
               <w:jc w:val="left"/>
             </w:pPr>
             <w:r>
+              <w:t xml:space="preserve">✅</w:t>
+            </w:r>
+            <w:r>
+              <w:t xml:space="preserve"> </w:t>
+            </w:r>
+            <w:r>
+              <w:rPr>
+                <w:rStyle w:val="VerbatimChar"/>
+              </w:rPr>
+              <w:t xml:space="preserve">LocaleSwitcher.astro</w:t>
+            </w:r>
+            <w:r>
+              <w:t xml:space="preserve"> </w:t>
+            </w:r>
+            <w:r>
+              <w:t xml:space="preserve">in Header + mobile drawer</w:t>
+            </w:r>
+          </w:p>
+        </w:tc>
+      </w:tr>
+      <w:tr>
+        <w:tc>
+          <w:tcPr/>
+          <w:p>
+            <w:pPr>
+              <w:pStyle w:val="Compact"/>
+              <w:jc w:val="left"/>
+            </w:pPr>
+            <w:r>
+              <w:rPr>
+                <w:rStyle w:val="VerbatimChar"/>
+              </w:rPr>
+              <w:t xml:space="preserve">&lt;html lang&gt;</w:t>
+            </w:r>
+            <w:r>
+              <w:t xml:space="preserve"> </w:t>
+            </w:r>
+            <w:r>
+              <w:t xml:space="preserve">dynamic per locale</w:t>
+            </w:r>
+          </w:p>
+        </w:tc>
+        <w:tc>
+          <w:tcPr/>
+          <w:p>
+            <w:pPr>
+              <w:pStyle w:val="Compact"/>
+              <w:jc w:val="left"/>
+            </w:pPr>
+            <w:r>
+              <w:t xml:space="preserve">✅</w:t>
+            </w:r>
+            <w:r>
+              <w:t xml:space="preserve"> </w:t>
+            </w:r>
+            <w:r>
+              <w:rPr>
+                <w:rStyle w:val="VerbatimChar"/>
+              </w:rPr>
+              <w:t xml:space="preserve">BaseLayout.astro</w:t>
+            </w:r>
+            <w:r>
+              <w:t xml:space="preserve"> </w:t>
+            </w:r>
+            <w:r>
+              <w:t xml:space="preserve">(derives from</w:t>
+            </w:r>
+            <w:r>
+              <w:t xml:space="preserve"> </w:t>
+            </w:r>
+            <w:r>
+              <w:rPr>
+                <w:rStyle w:val="VerbatimChar"/>
+              </w:rPr>
+              <w:t xml:space="preserve">HTML_LANG[locale]</w:t>
+            </w:r>
+            <w:r>
+              <w:t xml:space="preserve">)</w:t>
+            </w:r>
+          </w:p>
+        </w:tc>
+      </w:tr>
+      <w:tr>
+        <w:tc>
+          <w:tcPr/>
+          <w:p>
+            <w:pPr>
+              <w:pStyle w:val="Compact"/>
+              <w:jc w:val="left"/>
+            </w:pPr>
+            <w:r>
+              <w:rPr>
+                <w:rStyle w:val="VerbatimChar"/>
+              </w:rPr>
+              <w:t xml:space="preserve">og:locale</w:t>
+            </w:r>
+            <w:r>
+              <w:t xml:space="preserve">, translation suppression</w:t>
+            </w:r>
+          </w:p>
+        </w:tc>
+        <w:tc>
+          <w:tcPr/>
+          <w:p>
+            <w:pPr>
+              <w:pStyle w:val="Compact"/>
+              <w:jc w:val="left"/>
+            </w:pPr>
+            <w:r>
               <w:t xml:space="preserve">⚠ NOT BUILT</w:t>
             </w:r>
           </w:p>
@@ -1250,16 +1359,74 @@
               <w:jc w:val="left"/>
             </w:pPr>
             <w:r>
-              <w:rPr>
-                <w:rStyle w:val="VerbatimChar"/>
-              </w:rPr>
-              <w:t xml:space="preserve">&lt;html lang&gt;</w:t>
-            </w:r>
-            <w:r>
-              <w:t xml:space="preserve"> </w:t>
-            </w:r>
-            <w:r>
-              <w:t xml:space="preserve">dynamic per locale</w:t>
+              <w:t xml:space="preserve">URL prefix routing +</w:t>
+            </w:r>
+            <w:r>
+              <w:t xml:space="preserve"> </w:t>
+            </w:r>
+            <w:r>
+              <w:rPr>
+                <w:rStyle w:val="VerbatimChar"/>
+              </w:rPr>
+              <w:t xml:space="preserve">hreflang</w:t>
+            </w:r>
+            <w:r>
+              <w:t xml:space="preserve"> </w:t>
+            </w:r>
+            <w:r>
+              <w:t xml:space="preserve">+ canonicals</w:t>
+            </w:r>
+          </w:p>
+        </w:tc>
+        <w:tc>
+          <w:tcPr/>
+          <w:p>
+            <w:pPr>
+              <w:pStyle w:val="Compact"/>
+              <w:jc w:val="left"/>
+            </w:pPr>
+            <w:r>
+              <w:t xml:space="preserve">⚠ NOT BUILT</w:t>
+            </w:r>
+          </w:p>
+        </w:tc>
+      </w:tr>
+      <w:tr>
+        <w:tc>
+          <w:tcPr/>
+          <w:p>
+            <w:pPr>
+              <w:pStyle w:val="Compact"/>
+              <w:jc w:val="left"/>
+            </w:pPr>
+            <w:r>
+              <w:t xml:space="preserve">Named reviewer + cadence (chrome)</w:t>
+            </w:r>
+          </w:p>
+        </w:tc>
+        <w:tc>
+          <w:tcPr/>
+          <w:p>
+            <w:pPr>
+              <w:pStyle w:val="Compact"/>
+              <w:jc w:val="left"/>
+            </w:pPr>
+            <w:r>
+              <w:t xml:space="preserve">⚠ NOT BUILT</w:t>
+            </w:r>
+          </w:p>
+        </w:tc>
+      </w:tr>
+      <w:tr>
+        <w:tc>
+          <w:tcPr/>
+          <w:p>
+            <w:pPr>
+              <w:pStyle w:val="Compact"/>
+              <w:jc w:val="left"/>
+            </w:pPr>
+            <w:r>
+              <w:t xml:space="preserve">Style guide (safeguard 1)</w:t>
             </w:r>
           </w:p>
         </w:tc>
@@ -1280,150 +1447,7 @@
               <w:rPr>
                 <w:rStyle w:val="VerbatimChar"/>
               </w:rPr>
-              <w:t xml:space="preserve">BaseLayout.astro</w:t>
-            </w:r>
-            <w:r>
-              <w:t xml:space="preserve"> </w:t>
-            </w:r>
-            <w:r>
-              <w:t xml:space="preserve">(derives from</w:t>
-            </w:r>
-            <w:r>
-              <w:t xml:space="preserve"> </w:t>
-            </w:r>
-            <w:r>
-              <w:rPr>
-                <w:rStyle w:val="VerbatimChar"/>
-              </w:rPr>
-              <w:t xml:space="preserve">HTML_LANG[locale]</w:t>
-            </w:r>
-            <w:r>
-              <w:t xml:space="preserve">)</w:t>
-            </w:r>
-          </w:p>
-        </w:tc>
-      </w:tr>
-      <w:tr>
-        <w:tc>
-          <w:tcPr/>
-          <w:p>
-            <w:pPr>
-              <w:pStyle w:val="Compact"/>
-              <w:jc w:val="left"/>
-            </w:pPr>
-            <w:r>
-              <w:rPr>
-                <w:rStyle w:val="VerbatimChar"/>
-              </w:rPr>
-              <w:t xml:space="preserve">og:locale</w:t>
-            </w:r>
-            <w:r>
-              <w:t xml:space="preserve">, translation suppression</w:t>
-            </w:r>
-          </w:p>
-        </w:tc>
-        <w:tc>
-          <w:tcPr/>
-          <w:p>
-            <w:pPr>
-              <w:pStyle w:val="Compact"/>
-              <w:jc w:val="left"/>
-            </w:pPr>
-            <w:r>
-              <w:t xml:space="preserve">⚠ NOT BUILT</w:t>
-            </w:r>
-          </w:p>
-        </w:tc>
-      </w:tr>
-      <w:tr>
-        <w:tc>
-          <w:tcPr/>
-          <w:p>
-            <w:pPr>
-              <w:pStyle w:val="Compact"/>
-              <w:jc w:val="left"/>
-            </w:pPr>
-            <w:r>
-              <w:t xml:space="preserve">URL prefix routing +</w:t>
-            </w:r>
-            <w:r>
-              <w:t xml:space="preserve"> </w:t>
-            </w:r>
-            <w:r>
-              <w:rPr>
-                <w:rStyle w:val="VerbatimChar"/>
-              </w:rPr>
-              <w:t xml:space="preserve">hreflang</w:t>
-            </w:r>
-            <w:r>
-              <w:t xml:space="preserve"> </w:t>
-            </w:r>
-            <w:r>
-              <w:t xml:space="preserve">+ canonicals</w:t>
-            </w:r>
-          </w:p>
-        </w:tc>
-        <w:tc>
-          <w:tcPr/>
-          <w:p>
-            <w:pPr>
-              <w:pStyle w:val="Compact"/>
-              <w:jc w:val="left"/>
-            </w:pPr>
-            <w:r>
-              <w:t xml:space="preserve">⚠ NOT BUILT</w:t>
-            </w:r>
-          </w:p>
-        </w:tc>
-      </w:tr>
-      <w:tr>
-        <w:tc>
-          <w:tcPr/>
-          <w:p>
-            <w:pPr>
-              <w:pStyle w:val="Compact"/>
-              <w:jc w:val="left"/>
-            </w:pPr>
-            <w:r>
-              <w:t xml:space="preserve">Named reviewer + cadence (chrome)</w:t>
-            </w:r>
-          </w:p>
-        </w:tc>
-        <w:tc>
-          <w:tcPr/>
-          <w:p>
-            <w:pPr>
-              <w:pStyle w:val="Compact"/>
-              <w:jc w:val="left"/>
-            </w:pPr>
-            <w:r>
-              <w:t xml:space="preserve">⚠ NOT BUILT</w:t>
-            </w:r>
-          </w:p>
-        </w:tc>
-      </w:tr>
-      <w:tr>
-        <w:tc>
-          <w:tcPr/>
-          <w:p>
-            <w:pPr>
-              <w:pStyle w:val="Compact"/>
-              <w:jc w:val="left"/>
-            </w:pPr>
-            <w:r>
-              <w:t xml:space="preserve">Style guide (safeguard 1)</w:t>
-            </w:r>
-          </w:p>
-        </w:tc>
-        <w:tc>
-          <w:tcPr/>
-          <w:p>
-            <w:pPr>
-              <w:pStyle w:val="Compact"/>
-              <w:jc w:val="left"/>
-            </w:pPr>
-            <w:r>
-              <w:t xml:space="preserve">⚠ NOT BUILT</w:t>
+              <w:t xml:space="preserve">docs/TAGLISH-STYLE-GUIDE.md</w:t>
             </w:r>
           </w:p>
         </w:tc>

</xml_diff>

<commit_message>
i18n M3: update registers (Track 2 pieces done)
</commit_message>
<xml_diff>
--- a/docs/I18N-REGISTERS.docx
+++ b/docs/I18N-REGISTERS.docx
@@ -1108,7 +1108,37 @@
               <w:jc w:val="left"/>
             </w:pPr>
             <w:r>
-              <w:t xml:space="preserve">⚠ NOT BUILT</w:t>
+              <w:t xml:space="preserve">✅</w:t>
+            </w:r>
+            <w:r>
+              <w:t xml:space="preserve"> </w:t>
+            </w:r>
+            <w:r>
+              <w:rPr>
+                <w:rStyle w:val="VerbatimChar"/>
+              </w:rPr>
+              <w:t xml:space="preserve">articles-taglish</w:t>
+            </w:r>
+            <w:r>
+              <w:t xml:space="preserve"> </w:t>
+            </w:r>
+            <w:r>
+              <w:t xml:space="preserve">collection +</w:t>
+            </w:r>
+            <w:r>
+              <w:t xml:space="preserve"> </w:t>
+            </w:r>
+            <w:r>
+              <w:rPr>
+                <w:rStyle w:val="VerbatimChar"/>
+              </w:rPr>
+              <w:t xml:space="preserve">sourceHash</w:t>
+            </w:r>
+            <w:r>
+              <w:t xml:space="preserve"> </w:t>
+            </w:r>
+            <w:r>
+              <w:t xml:space="preserve">in frontmatter</w:t>
             </w:r>
           </w:p>
         </w:tc>
@@ -1134,7 +1164,22 @@
               <w:jc w:val="left"/>
             </w:pPr>
             <w:r>
-              <w:t xml:space="preserve">⚠ NOT BUILT</w:t>
+              <w:t xml:space="preserve">✅</w:t>
+            </w:r>
+            <w:r>
+              <w:t xml:space="preserve"> </w:t>
+            </w:r>
+            <w:r>
+              <w:rPr>
+                <w:rStyle w:val="VerbatimChar"/>
+              </w:rPr>
+              <w:t xml:space="preserve">generate-taglish.ts</w:t>
+            </w:r>
+            <w:r>
+              <w:t xml:space="preserve"> </w:t>
+            </w:r>
+            <w:r>
+              <w:t xml:space="preserve">(admin) + publish-time generation</w:t>
             </w:r>
           </w:p>
         </w:tc>
@@ -1160,7 +1205,22 @@
               <w:jc w:val="left"/>
             </w:pPr>
             <w:r>
-              <w:t xml:space="preserve">⚠ NOT BUILT</w:t>
+              <w:t xml:space="preserve">✅</w:t>
+            </w:r>
+            <w:r>
+              <w:t xml:space="preserve"> </w:t>
+            </w:r>
+            <w:r>
+              <w:rPr>
+                <w:rStyle w:val="VerbatimChar"/>
+              </w:rPr>
+              <w:t xml:space="preserve">article-locale.ts</w:t>
+            </w:r>
+            <w:r>
+              <w:t xml:space="preserve"> </w:t>
+            </w:r>
+            <w:r>
+              <w:t xml:space="preserve">falls back to English when Taglish absent</w:t>
             </w:r>
           </w:p>
         </w:tc>

</xml_diff>

<commit_message>
i18n M4: locale-aware no-JS subscribe redirect; register + ADR-010 docs
</commit_message>
<xml_diff>
--- a/docs/I18N-REGISTERS.docx
+++ b/docs/I18N-REGISTERS.docx
@@ -1405,6 +1405,154 @@
               <w:jc w:val="left"/>
             </w:pPr>
             <w:r>
+              <w:t xml:space="preserve">✅</w:t>
+            </w:r>
+            <w:r>
+              <w:t xml:space="preserve"> </w:t>
+            </w:r>
+            <w:r>
+              <w:rPr>
+                <w:rStyle w:val="VerbatimChar"/>
+              </w:rPr>
+              <w:t xml:space="preserve">SEO.astro</w:t>
+            </w:r>
+            <w:r>
+              <w:t xml:space="preserve"> </w:t>
+            </w:r>
+            <w:r>
+              <w:t xml:space="preserve">(</w:t>
+            </w:r>
+            <w:r>
+              <w:rPr>
+                <w:rStyle w:val="VerbatimChar"/>
+              </w:rPr>
+              <w:t xml:space="preserve">og:locale</w:t>
+            </w:r>
+            <w:r>
+              <w:t xml:space="preserve"> </w:t>
+            </w:r>
+            <w:r>
+              <w:t xml:space="preserve">+</w:t>
+            </w:r>
+            <w:r>
+              <w:t xml:space="preserve"> </w:t>
+            </w:r>
+            <w:r>
+              <w:rPr>
+                <w:rStyle w:val="VerbatimChar"/>
+              </w:rPr>
+              <w:t xml:space="preserve">og:locale:alternate</w:t>
+            </w:r>
+            <w:r>
+              <w:t xml:space="preserve"> </w:t>
+            </w:r>
+            <w:r>
+              <w:t xml:space="preserve">per locale)</w:t>
+            </w:r>
+          </w:p>
+        </w:tc>
+      </w:tr>
+      <w:tr>
+        <w:tc>
+          <w:tcPr/>
+          <w:p>
+            <w:pPr>
+              <w:pStyle w:val="Compact"/>
+              <w:jc w:val="left"/>
+            </w:pPr>
+            <w:r>
+              <w:t xml:space="preserve">URL prefix routing +</w:t>
+            </w:r>
+            <w:r>
+              <w:t xml:space="preserve"> </w:t>
+            </w:r>
+            <w:r>
+              <w:rPr>
+                <w:rStyle w:val="VerbatimChar"/>
+              </w:rPr>
+              <w:t xml:space="preserve">hreflang</w:t>
+            </w:r>
+            <w:r>
+              <w:t xml:space="preserve"> </w:t>
+            </w:r>
+            <w:r>
+              <w:t xml:space="preserve">+ canonicals</w:t>
+            </w:r>
+          </w:p>
+        </w:tc>
+        <w:tc>
+          <w:tcPr/>
+          <w:p>
+            <w:pPr>
+              <w:pStyle w:val="Compact"/>
+              <w:jc w:val="left"/>
+            </w:pPr>
+            <w:r>
+              <w:t xml:space="preserve">✅</w:t>
+            </w:r>
+            <w:r>
+              <w:t xml:space="preserve"> </w:t>
+            </w:r>
+            <w:r>
+              <w:rPr>
+                <w:rStyle w:val="VerbatimChar"/>
+              </w:rPr>
+              <w:t xml:space="preserve">/en/</w:t>
+            </w:r>
+            <w:r>
+              <w:t xml:space="preserve"> </w:t>
+            </w:r>
+            <w:r>
+              <w:t xml:space="preserve">page tree +</w:t>
+            </w:r>
+            <w:r>
+              <w:t xml:space="preserve"> </w:t>
+            </w:r>
+            <w:r>
+              <w:rPr>
+                <w:rStyle w:val="VerbatimChar"/>
+              </w:rPr>
+              <w:t xml:space="preserve">hreflang</w:t>
+            </w:r>
+            <w:r>
+              <w:t xml:space="preserve"> </w:t>
+            </w:r>
+            <w:r>
+              <w:t xml:space="preserve">(fil/en/x-default) + canonical in</w:t>
+            </w:r>
+            <w:r>
+              <w:t xml:space="preserve"> </w:t>
+            </w:r>
+            <w:r>
+              <w:rPr>
+                <w:rStyle w:val="VerbatimChar"/>
+              </w:rPr>
+              <w:t xml:space="preserve">SEO.astro</w:t>
+            </w:r>
+          </w:p>
+        </w:tc>
+      </w:tr>
+      <w:tr>
+        <w:tc>
+          <w:tcPr/>
+          <w:p>
+            <w:pPr>
+              <w:pStyle w:val="Compact"/>
+              <w:jc w:val="left"/>
+            </w:pPr>
+            <w:r>
+              <w:t xml:space="preserve">Named reviewer + cadence (chrome)</w:t>
+            </w:r>
+          </w:p>
+        </w:tc>
+        <w:tc>
+          <w:tcPr/>
+          <w:p>
+            <w:pPr>
+              <w:pStyle w:val="Compact"/>
+              <w:jc w:val="left"/>
+            </w:pPr>
+            <w:r>
               <w:t xml:space="preserve">⚠ NOT BUILT</w:t>
             </w:r>
           </w:p>
@@ -1419,73 +1567,6 @@
               <w:jc w:val="left"/>
             </w:pPr>
             <w:r>
-              <w:t xml:space="preserve">URL prefix routing +</w:t>
-            </w:r>
-            <w:r>
-              <w:t xml:space="preserve"> </w:t>
-            </w:r>
-            <w:r>
-              <w:rPr>
-                <w:rStyle w:val="VerbatimChar"/>
-              </w:rPr>
-              <w:t xml:space="preserve">hreflang</w:t>
-            </w:r>
-            <w:r>
-              <w:t xml:space="preserve"> </w:t>
-            </w:r>
-            <w:r>
-              <w:t xml:space="preserve">+ canonicals</w:t>
-            </w:r>
-          </w:p>
-        </w:tc>
-        <w:tc>
-          <w:tcPr/>
-          <w:p>
-            <w:pPr>
-              <w:pStyle w:val="Compact"/>
-              <w:jc w:val="left"/>
-            </w:pPr>
-            <w:r>
-              <w:t xml:space="preserve">⚠ NOT BUILT</w:t>
-            </w:r>
-          </w:p>
-        </w:tc>
-      </w:tr>
-      <w:tr>
-        <w:tc>
-          <w:tcPr/>
-          <w:p>
-            <w:pPr>
-              <w:pStyle w:val="Compact"/>
-              <w:jc w:val="left"/>
-            </w:pPr>
-            <w:r>
-              <w:t xml:space="preserve">Named reviewer + cadence (chrome)</w:t>
-            </w:r>
-          </w:p>
-        </w:tc>
-        <w:tc>
-          <w:tcPr/>
-          <w:p>
-            <w:pPr>
-              <w:pStyle w:val="Compact"/>
-              <w:jc w:val="left"/>
-            </w:pPr>
-            <w:r>
-              <w:t xml:space="preserve">⚠ NOT BUILT</w:t>
-            </w:r>
-          </w:p>
-        </w:tc>
-      </w:tr>
-      <w:tr>
-        <w:tc>
-          <w:tcPr/>
-          <w:p>
-            <w:pPr>
-              <w:pStyle w:val="Compact"/>
-              <w:jc w:val="left"/>
-            </w:pPr>
-            <w:r>
               <w:t xml:space="preserve">Style guide (safeguard 1)</w:t>
             </w:r>
           </w:p>
@@ -1533,7 +1614,47 @@
               <w:jc w:val="left"/>
             </w:pPr>
             <w:r>
-              <w:t xml:space="preserve">⚠ NOT BUILT</w:t>
+              <w:t xml:space="preserve">◐ Resolver logic built (</w:t>
+            </w:r>
+            <w:r>
+              <w:rPr>
+                <w:rStyle w:val="VerbatimChar"/>
+              </w:rPr>
+              <w:t xml:space="preserve">resolveLocale()</w:t>
+            </w:r>
+            <w:r>
+              <w:t xml:space="preserve"> </w:t>
+            </w:r>
+            <w:r>
+              <w:t xml:space="preserve">in</w:t>
+            </w:r>
+            <w:r>
+              <w:t xml:space="preserve"> </w:t>
+            </w:r>
+            <w:r>
+              <w:rPr>
+                <w:rStyle w:val="VerbatimChar"/>
+              </w:rPr>
+              <w:t xml:space="preserve">i18n.ts</w:t>
+            </w:r>
+            <w:r>
+              <w:t xml:space="preserve">); edge auto-redirect</w:t>
+            </w:r>
+            <w:r>
+              <w:t xml:space="preserve"> </w:t>
+            </w:r>
+            <w:r>
+              <w:rPr>
+                <w:bCs/>
+                <w:b/>
+              </w:rPr>
+              <w:t xml:space="preserve">deferred to phase 2</w:t>
+            </w:r>
+            <w:r>
+              <w:t xml:space="preserve"> </w:t>
+            </w:r>
+            <w:r>
+              <w:t xml:space="preserve">— see ADR-010</w:t>
             </w:r>
           </w:p>
         </w:tc>

</xml_diff>